<commit_message>
Final course work: title page details, README for stages 3-4, translation, explanations, bot
Co-Authored-By: Claude Opus 5.5 <noreply@anthropic.com>
Claude-Session: https://claude.ai/code/session_01JXCQy6FrpVZFgwGXFHfqXs
</commit_message>
<xml_diff>
--- a/deliverables/Կուրսային աշխատանք 3 (փուլ 4).docx
+++ b/deliverables/Կուրսային աշխատանք 3 (փուլ 4).docx
@@ -547,7 +547,7 @@
                 <w:b w:val="false"/>
                 <w:bCs w:val="false"/>
               </w:rPr>
-              <w:t xml:space="preserve">Ա. Մ. Մանուկյան</w:t>
+              <w:t xml:space="preserve">Կ. Հ. Նիկողոսյան</w:t>
             </w:r>
           </w:p>
         </w:tc>
@@ -659,7 +659,7 @@
           <w:sz w:val="22"/>
           <w:szCs w:val="22"/>
         </w:rPr>
-        <w:t xml:space="preserve">ՏՀՏԷ ինստիտուտ, ՏՏ և Ա ամբիոն, ՏՀ մասնագիտություն, ՏՏ 261 ակադեմիական խումբ</w:t>
+        <w:t xml:space="preserve">ՏՀՏԷ ինստիտուտ, ՏՏ և Ա ամբիոն, «Արհեստական բանականությամբ համակարգեր» մասնագիտություն, ՏՏ361 ակադեմիական խումբ</w:t>
       </w:r>
     </w:p>
     <w:p>
@@ -3661,7 +3661,7 @@
         <w:rPr>
           <w:rFonts w:ascii="GHEA Grapalat" w:cs="GHEA Grapalat" w:eastAsia="GHEA Grapalat" w:hAnsi="GHEA Grapalat"/>
         </w:rPr>
-        <w:t xml:space="preserve">Համակարգը իրականացված է Python 3 լեզվով։ Հիմնական մոդուլներն են․ data.py (տվյալների բեռնում և մաքրում), train.py (ելակետային մոդելներ), optimize.py (նեյրոնային փորձեր), improve_v2.py (փուլ 2-ի հատկանիշներ և համադրություն), train_transformer.py և stack_v4.py (փուլեր 3–4), translate.py (թարգմանություն), explain.py (բացատրություն), verify.py և evidence.py (ստուգման շղթա), telegram_bot.py (բոտ), app.py (FastAPI ծառայություն)։ Ծառայությունը տրամադրում է /predict (դասակարգում) և /verify (ստուգում և ուղղում) մուտքեր, իսկ վեբ միջերեսը հայերեն է (նկ. 3, նկ. 4)։</w:t>
+        <w:t xml:space="preserve">Համակարգը իրականացված է Python 3 լեզվով։ Հիմնական մոդուլներն են․ data.py (տվյալների բեռնում և մաքրում), train.py (ելակետային մոդելներ), optimize.py (նեյրոնային փորձեր), improve_v2.py (փուլ 2-ի հատկանիշներ և համադրություն), train_transformer.py և stack_v4.py (փուլեր 3–4), translate.py (թարգմանություն), explain.py (բացատրություն), verify.py և evidence.py (ստուգման շղթա), telegram_bot.py (բոտ), app.py (FastAPI ծառայություն)։ Ծառայությունը տրամադրում է /analyze (դասակարգում) և /verify (ստուգում և ուղղում) մուտքեր, իսկ վեբ միջերեսը հայերեն է (նկ. 3, նկ. 4)։</w:t>
       </w:r>
     </w:p>
     <w:p>
@@ -3892,7 +3892,7 @@
         <w:rPr>
           <w:rFonts w:ascii="GHEA Grapalat" w:cs="GHEA Grapalat" w:eastAsia="GHEA Grapalat" w:hAnsi="GHEA Grapalat"/>
         </w:rPr>
-        <w:t xml:space="preserve">Ծրագրի որակը ապահովված է 108 ավտոմատ թեստով (pytest), որոնք ստուգում են նախնական մաքրումը, բաժանումների միջև արտահոսքի բացակայությունը, չափանիշների վերահաշվարկը, ծառայության մուտքային տվյալների վավերացումը, արտաքին ծառայությունների խափանումների մշակումը աղբյուրի բառացի պահպանումը, պահպանված մոդելների թեստային արդյունքների վերարտադրումը, թարգմանության ուղին, բացատրությունները և Telegram բոտի պատասխանները։ Բոլոր թեստերը հաջողությամբ անցել են։ Վերարտադրելիության համար ֆիքսված են պատահական թվերի seed-ը, մոդելների տարբերակները և մուտքային ֆայլերի SHA-256 հեշերը։</w:t>
+        <w:t xml:space="preserve">Ծրագրի որակը ապահովված է 108 ավտոմատ թեստով (pytest), որոնք ստուգում են նախնական մաքրումը, բաժանումների միջև արտահոսքի բացակայությունը, չափանիշների վերահաշվարկը, ծառայության մուտքային տվյալների վավերացումը, արտաքին ծառայությունների խափանումների մշակումը, աղբյուրի բառացի պահպանումը, պահպանված մոդելների թեստային արդյունքների վերարտադրումը, թարգմանության ուղին, բացատրությունները և Telegram բոտի պատասխանները։ Բոլոր թեստերը հաջողությամբ անցել են։ Վերարտադրելիության համար ֆիքսված են պատահական թվերի seed-ը, մոդելների տարբերակները և մուտքային ֆայլերի SHA-256 հեշերը։</w:t>
       </w:r>
     </w:p>
     <w:p>

</xml_diff>